<commit_message>
Remove the data comparison section
It is job-specific content (e.g. a HydroFORM 2022-vs-2026 comparison) that is better added by
hand when a report needs it.

- Word template: the comparison block and its section break are removed; reports come out
  exactly as they did when the section was empty
- Editor section, ComparisonForm/formset, Report.comparison_title and the 'comparison' image
  kind removed (migration 0019 turns any saved comparison images into photo-summary images)
- Tests and TEMPLATE_TAGS.md updated

Co-Authored-By: Claude Opus 5.5 <noreply@anthropic.com>
</commit_message>
<xml_diff>
--- a/word_templates/paut_hic_long_form.docx
+++ b/word_templates/paut_hic_long_form.docx
@@ -2673,157 +2673,6 @@
           <w:szCs w:val="24"/>
         </w:rPr>
         <w:fldChar w:fldCharType="end"/>
-      </w:r>
-    </w:p>
-    <w:p>
-      <w:r>
-        <w:t>{%p if figures.comparison %}</w:t>
-      </w:r>
-    </w:p>
-    <w:p>
-      <w:pPr>
-        <w:pStyle w:val="Summary5"/>
-        <w:tabs>
-          <w:tab w:val="clear" w:pos="-720"/>
-        </w:tabs>
-        <w:suppressAutoHyphens w:val="0"/>
-        <w:spacing w:before="0" w:after="120"/>
-        <w:jc w:val="center"/>
-        <w:rPr>
-          <w:b/>
-          <w:bCs/>
-          <w:spacing w:val="0"/>
-          <w:sz w:val="32"/>
-          <w:szCs w:val="24"/>
-        </w:rPr>
-      </w:pPr>
-      <w:r>
-        <w:rPr>
-          <w:b/>
-          <w:bCs/>
-          <w:spacing w:val="0"/>
-          <w:sz w:val="32"/>
-          <w:szCs w:val="24"/>
-        </w:rPr>
-        <w:t>{{ comparison_title }}</w:t>
-      </w:r>
-    </w:p>
-    <w:p>
-      <w:r>
-        <w:t>{%p for f in figures.comparison %}</w:t>
-      </w:r>
-    </w:p>
-    <w:p>
-      <w:pPr>
-        <w:pStyle w:val="Summary5"/>
-        <w:tabs>
-          <w:tab w:val="clear" w:pos="-720"/>
-        </w:tabs>
-        <w:suppressAutoHyphens w:val="0"/>
-        <w:spacing w:before="0" w:after="120"/>
-        <w:jc w:val="center"/>
-        <w:rPr>
-          <w:b/>
-          <w:bCs/>
-          <w:spacing w:val="0"/>
-          <w:sz w:val="32"/>
-          <w:szCs w:val="24"/>
-        </w:rPr>
-      </w:pPr>
-      <w:r>
-        <w:rPr>
-          <w:b/>
-          <w:bCs/>
-          <w:spacing w:val="0"/>
-          <w:sz w:val="32"/>
-          <w:szCs w:val="24"/>
-        </w:rPr>
-        <w:t>{{ f.title }}</w:t>
-      </w:r>
-    </w:p>
-    <w:p>
-      <w:r>
-        <w:t>{%p for img in f.images %}</w:t>
-      </w:r>
-    </w:p>
-    <w:p>
-      <w:pPr>
-        <w:pStyle w:val="Summary5"/>
-        <w:tabs>
-          <w:tab w:val="clear" w:pos="-720"/>
-        </w:tabs>
-        <w:suppressAutoHyphens w:val="0"/>
-        <w:spacing w:before="0" w:after="120"/>
-        <w:jc w:val="center"/>
-        <w:rPr>
-          <w:spacing w:val="0"/>
-        </w:rPr>
-      </w:pPr>
-      <w:r>
-        <w:rPr>
-          <w:spacing w:val="-2"/>
-        </w:rPr>
-        <w:t>{{ img }}</w:t>
-      </w:r>
-    </w:p>
-    <w:p>
-      <w:r>
-        <w:t>{%p endfor %}</w:t>
-      </w:r>
-    </w:p>
-    <w:p>
-      <w:r>
-        <w:t>{%p if not loop.last %}</w:t>
-      </w:r>
-    </w:p>
-    <w:p>
-      <w:pPr>
-        <w:spacing w:after="0"/>
-        <w:jc w:val="left"/>
-      </w:pPr>
-      <w:r>
-        <w:br w:type="page"/>
-      </w:r>
-      <w:r>
-        <w:lastRenderedPageBreak/>
-        <w:tab/>
-      </w:r>
-      <w:r>
-        <w:tab/>
-      </w:r>
-    </w:p>
-    <w:p>
-      <w:r>
-        <w:t>{%p endif %}</w:t>
-      </w:r>
-    </w:p>
-    <w:p>
-      <w:r>
-        <w:t>{%p endfor %}</w:t>
-      </w:r>
-    </w:p>
-    <w:p>
-      <w:pPr>
-        <w:pStyle w:val="Summary5"/>
-        <w:tabs>
-          <w:tab w:val="clear" w:pos="-720"/>
-        </w:tabs>
-        <w:suppressAutoHyphens w:val="0"/>
-        <w:spacing w:before="0" w:after="120"/>
-        <w:rPr>
-          <w:spacing w:val="0"/>
-        </w:rPr>
-        <w:sectPr>
-          <w:pgSz w:w="12240" w:h="15840" w:code="1"/>
-          <w:pgMar w:top="1152" w:right="810" w:bottom="1152" w:left="720" w:header="720" w:footer="432" w:gutter="0"/>
-          <w:pgNumType w:chapSep="period"/>
-          <w:cols w:space="720"/>
-        </w:sectPr>
-      </w:pPr>
-    </w:p>
-    <w:p>
-      <w:r>
-        <w:t>{%p endif %}</w:t>
       </w:r>
     </w:p>
     <w:p>

</xml_diff>